<commit_message>
Fix payment amounts and formula recalculation
</commit_message>
<xml_diff>
--- a/docs/Excel報名資料自動填寫工具_使用說明.docx
+++ b/docs/Excel報名資料自動填寫工具_使用說明.docx
@@ -2471,7 +2471,7 @@
         <w:rPr>
           <w:rFonts w:ascii="Calibri" w:hAnsi="Calibri" w:eastAsia="Microsoft JhengHei"/>
         </w:rPr>
-        <w:t>一般單筆付款：通常產生 1 筆資料。</w:t>
+        <w:t>一般單筆付款：通常產生 1 筆資料，收款金額等於課程金額。</w:t>
       </w:r>
     </w:p>
     <w:p>
@@ -2482,7 +2482,7 @@
         <w:rPr>
           <w:rFonts w:ascii="Calibri" w:hAnsi="Calibri" w:eastAsia="Microsoft JhengHei"/>
         </w:rPr>
-        <w:t>多項目付款：可能依項目拆成多筆資料。</w:t>
+        <w:t>多項目付款：可能依項目拆成多筆資料，每筆收款金額等於該筆課程金額。</w:t>
       </w:r>
     </w:p>
     <w:p>
@@ -2507,6 +2507,38 @@
     </w:p>
     <w:p>
       <w:pPr>
+        <w:pStyle w:val="Heading2"/>
+        <w:jc w:val="left"/>
+      </w:pPr>
+      <w:r>
+        <w:rPr>
+          <w:rFonts w:ascii="Calibri" w:hAnsi="Calibri" w:eastAsia="Microsoft JhengHei"/>
+          <w:b/>
+          <w:color w:val="2E74B5"/>
+        </w:rPr>
+        <w:t>9. Excel 公式更新</w:t>
+      </w:r>
+    </w:p>
+    <w:p>
+      <w:r>
+        <w:rPr>
+          <w:rFonts w:ascii="Calibri" w:hAnsi="Calibri" w:eastAsia="Microsoft JhengHei"/>
+          <w:b w:val="0"/>
+        </w:rPr>
+        <w:t>工具寫入資料後，會要求 Excel 在開啟檔案時重新計算公式欄位，例如分期差額。</w:t>
+      </w:r>
+    </w:p>
+    <w:p>
+      <w:r>
+        <w:rPr>
+          <w:rFonts w:ascii="Calibri" w:hAnsi="Calibri" w:eastAsia="Microsoft JhengHei"/>
+          <w:b w:val="0"/>
+        </w:rPr>
+        <w:t>如果 Excel 開啟後仍看到舊值，請確認 Excel 的計算選項不是手動模式，或按一次「公式」中的「立即計算」。</w:t>
+      </w:r>
+    </w:p>
+    <w:p>
+      <w:pPr>
         <w:pStyle w:val="Heading1"/>
         <w:jc w:val="left"/>
       </w:pPr>
@@ -2516,7 +2548,7 @@
           <w:b/>
           <w:color w:val="2E74B5"/>
         </w:rPr>
-        <w:t>9. 常見問題與處理方式</w:t>
+        <w:t>10. 常見問題與處理方式</w:t>
       </w:r>
     </w:p>
     <w:tbl>
@@ -3036,7 +3068,7 @@
           <w:b/>
           <w:color w:val="2E74B5"/>
         </w:rPr>
-        <w:t>10. 安全使用建議</w:t>
+        <w:t>11. 安全使用建議</w:t>
       </w:r>
     </w:p>
     <w:p>

</xml_diff>